<commit_message>
Phase 4-5: Corpus-driven drafting engine + plan status unification
New modules:
- cdm_tool_07.py — fossil-fuel displacement factors (resolves plan spec mismatch)
- cdm_tool_12.py — baseline identification decision tree (resolves plan spec mismatch)
- src/pdd_agent/drafting/ — CorpusProvider + FactSubstitutionEngine with
  [ADAPTED FROM CORPUS: ...] provenance markers
- methods tests: test_cli_pdf, test_corpus_provider, test_fact_substitution

Wired:
- --pdf CLI flag on pdd-agent export (calls export_docx_to_pdf)
- --provider corpus available in screen/draft commands
- LLM-based methodology screening with deterministic fallback
- CorpusProvider registered in ProviderRegistry

Plans: updated all 9 plan files with accurate checkbox status
Cleanup: removed stray =1.0.0 artifact, added methodology README

454 tests pass (313→454, +141 new, zero regressions)
</commit_message>
<xml_diff>
--- a/reports/demo-packages/soc-son-like-waste-to-power-demonstration-project/latest.docx
+++ b/reports/demo-packages/soc-son-like-waste-to-power-demonstration-project/latest.docx
@@ -43,11 +43,11 @@
         <w:jc w:val="center"/>
       </w:pPr>
       <w:r>
-        <w:t>Run ID: run-20260525025411-4b6f43</w:t>
+        <w:t>Run ID: run-20260530073253-53b48b</w:t>
         <w:br/>
       </w:r>
       <w:r>
-        <w:t>Generated: 2026-05-25 09:54</w:t>
+        <w:t>Generated: 2026-05-30 14:32</w:t>
         <w:br/>
       </w:r>
       <w:r>
@@ -356,7 +356,7 @@
                 <w:b w:val="0"/>
                 <w:sz w:val="18"/>
               </w:rPr>
-              <w:t>25-May-2026</w:t>
+              <w:t>30-May-2026</w:t>
             </w:r>
           </w:p>
         </w:tc>
@@ -620,7 +620,7 @@
         <w:t xml:space="preserve">Retrieved provenance: </w:t>
       </w:r>
       <w:r>
-        <w:t>[CORPUS: VCS_Bergama_Project-Description.norm, Summary Description of the Project]; [CORPUS: VCS_Bergama_Project-Description.norm, Summary Description of the Project]; [CORPUS: VCS_DRAFT_Yanjiang_Project-Description.norm, Summary Description of the Project]; [CORPUS: VCS_DRAFT_Yanjiang_Project-Description.norm, Summary Description of the Project]; [CORPUS: VCS_Guangzhou_Project-Description.norm, Summary Description of the Project]</w:t>
+        <w:t>[CORPUS: VCS_Bergama_Project-Description.norm, Summary Description of the Project]; [CORPUS: VCS_Bergama_Project-Description.norm, Summary Description of the Project]; [CORPUS: VCS_Inegol_Project-Description.norm, Summary Description of the Project]; [CORPUS: VCS_Inegol_Project-Description.norm, Summary Description of the Project]; [CORPUS: VCS_Soc_Son_Project-Description.norm, Summary Description of the Project]</w:t>
       </w:r>
     </w:p>
     <w:p>
@@ -723,7 +723,7 @@
         <w:t xml:space="preserve">Retrieved provenance: </w:t>
       </w:r>
       <w:r>
-        <w:t>[CORPUS: VCS_Bergama_Project-Description.norm, Sectoral Scope and Project Type]; [CORPUS: VCS_Bergama_Project-Description.norm, Sectoral Scope and Project Type]; [CORPUS: VCS_DRAFT_Yanjiang_Project-Description.norm, Sectoral Scope and Project Type]; [CORPUS: VCS_DRAFT_Yanjiang_Project-Description.norm, Sectoral Scope and Project Type]; [CORPUS: VCS_Guangzhou_Project-Description.norm, Sectoral Scope and Project Type]</w:t>
+        <w:t>[CORPUS: VCS_Bergama_Project-Description.norm, Sectoral Scope and Project Type]; [CORPUS: VCS_Bergama_Project-Description.norm, Sectoral Scope and Project Type]; [CORPUS: VCS_Inegol_Project-Description.norm, Sectoral Scope and Project Type]; [CORPUS: VCS_Inegol_Project-Description.norm, Sectoral Scope and Project Type]; [CORPUS: VCS_Soc_Son_Project-Description.norm, Sectoral Scope and Project Type]</w:t>
       </w:r>
     </w:p>
     <w:p>
@@ -826,7 +826,7 @@
         <w:t xml:space="preserve">Retrieved provenance: </w:t>
       </w:r>
       <w:r>
-        <w:t>[CORPUS: VCS_Bergama_Project-Description.norm, Project Eligibility]; [CORPUS: VCS_Bergama_Project-Description.norm, Project Eligibility]; [CORPUS: VCS_DRAFT_Yanjiang_Project-Description.norm, Project Eligibility]; [CORPUS: VCS_DRAFT_Yanjiang_Project-Description.norm, Project Eligibility]; [CORPUS: VCS_Guangzhou_Project-Description.norm, Project Eligibility]</w:t>
+        <w:t>[CORPUS: VCS_Bergama_Project-Description.norm, Project Eligibility]; [CORPUS: VCS_Bergama_Project-Description.norm, Project Eligibility]; [CORPUS: VCS_Inegol_Project-Description.norm, Project Eligibility]; [CORPUS: VCS_Inegol_Project-Description.norm, Project Eligibility]; [CORPUS: VCS_Soc_Son_Project-Description.norm, Project Eligibility]</w:t>
       </w:r>
     </w:p>
     <w:p>
@@ -929,7 +929,7 @@
         <w:t xml:space="preserve">Retrieved provenance: </w:t>
       </w:r>
       <w:r>
-        <w:t>[CORPUS: VCS_Bergama_Project-Description.norm, Project Design]; [CORPUS: VCS_Bergama_Project-Description.norm, Project Design]; [CORPUS: VCS_DRAFT_Yanjiang_Project-Description.norm, Project Design]; [CORPUS: VCS_DRAFT_Yanjiang_Project-Description.norm, Project Design]; [CORPUS: VCS_Guangzhou_Project-Description.norm, Project Design]</w:t>
+        <w:t>[CORPUS: VCS_Bergama_Project-Description.norm, Project Design]; [CORPUS: VCS_Bergama_Project-Description.norm, Project Design]; [CORPUS: VCS_Inegol_Project-Description.norm, Project Design]; [CORPUS: VCS_Inegol_Project-Description.norm, Project Design]; [CORPUS: VCS_Soc_Son_Project-Description.norm, Project Design]</w:t>
       </w:r>
     </w:p>
     <w:p>
@@ -1032,7 +1032,7 @@
         <w:t xml:space="preserve">Retrieved provenance: </w:t>
       </w:r>
       <w:r>
-        <w:t>[CORPUS: VCS_Bergama_Project-Description.norm, Project Proponent]; [CORPUS: VCS_Bergama_Project-Description.norm, Project Proponent]; [CORPUS: VCS_DRAFT_Yanjiang_Project-Description.norm, Project Proponent]; [CORPUS: VCS_DRAFT_Yanjiang_Project-Description.norm, Project Proponent]; [CORPUS: VCS_Guangzhou_Project-Description.norm, Project Proponent]</w:t>
+        <w:t>[CORPUS: VCS_Bergama_Project-Description.norm, Project Proponent]; [CORPUS: VCS_Bergama_Project-Description.norm, Project Proponent]; [CORPUS: VCS_Inegol_Project-Description.norm, Project Proponent]; [CORPUS: VCS_Inegol_Project-Description.norm, Project Proponent]; [CORPUS: VCS_Soc_Son_Project-Description.norm, Project Proponent]</w:t>
       </w:r>
     </w:p>
     <w:p>
@@ -1135,7 +1135,7 @@
         <w:t xml:space="preserve">Retrieved provenance: </w:t>
       </w:r>
       <w:r>
-        <w:t>[CORPUS: VCS_Bergama_Project-Description.norm, Other Entities Involved in the Project]; [CORPUS: VCS_Bergama_Project-Description.norm, Other Entities Involved in the Project]; [CORPUS: VCS_DRAFT_Yanjiang_Project-Description.norm, Other Entities Involved in the Project]; [CORPUS: VCS_DRAFT_Yanjiang_Project-Description.norm, Other Entities Involved in the Project]; [CORPUS: VCS_Guangzhou_Project-Description.norm, Other Entities Involved in the Project]</w:t>
+        <w:t>[CORPUS: VCS_Bergama_Project-Description.norm, Other Entities Involved in the Project]; [CORPUS: VCS_Bergama_Project-Description.norm, Other Entities Involved in the Project]; [CORPUS: VCS_Inegol_Project-Description.norm, Other Entities Involved in the Project]; [CORPUS: VCS_Inegol_Project-Description.norm, Other Entities Involved in the Project]; [CORPUS: VCS_Soc_Son_Project-Description.norm, Other Entities Involved in the Project]</w:t>
       </w:r>
     </w:p>
     <w:p>
@@ -1238,7 +1238,7 @@
         <w:t xml:space="preserve">Retrieved provenance: </w:t>
       </w:r>
       <w:r>
-        <w:t>[CORPUS: VCS_Bergama_Project-Description.norm, Ownership]; [CORPUS: VCS_Bergama_Project-Description.norm, Ownership]; [CORPUS: VCS_DRAFT_Yanjiang_Project-Description.norm, Ownership]; [CORPUS: VCS_DRAFT_Yanjiang_Project-Description.norm, Ownership]; [CORPUS: VCS_Guangzhou_Project-Description.norm, Ownership]</w:t>
+        <w:t>[CORPUS: VCS_Bergama_Project-Description.norm, Ownership]; [CORPUS: VCS_Bergama_Project-Description.norm, Ownership]; [CORPUS: VCS_Inegol_Project-Description.norm, Ownership]; [CORPUS: VCS_Inegol_Project-Description.norm, Ownership]; [CORPUS: VCS_Soc_Son_Project-Description.norm, Ownership]</w:t>
       </w:r>
     </w:p>
     <w:p>
@@ -1341,7 +1341,7 @@
         <w:t xml:space="preserve">Retrieved provenance: </w:t>
       </w:r>
       <w:r>
-        <w:t>[CORPUS: VCS_Bergama_Project-Description.norm, Project Start Date]; [CORPUS: VCS_Bergama_Project-Description.norm, Project Start Date]; [CORPUS: VCS_DRAFT_Yanjiang_Project-Description.norm, Project Start Date]; [CORPUS: VCS_DRAFT_Yanjiang_Project-Description.norm, Project Start Date]; [CORPUS: VCS_Guangzhou_Project-Description.norm, Project Start Date]</w:t>
+        <w:t>[CORPUS: VCS_Bergama_Project-Description.norm, Project Start Date]; [CORPUS: VCS_Bergama_Project-Description.norm, Project Start Date]; [CORPUS: VCS_Inegol_Project-Description.norm, Project Start Date]; [CORPUS: VCS_Inegol_Project-Description.norm, Project Start Date]; [CORPUS: VCS_Soc_Son_Project-Description.norm, Project Start Date]</w:t>
       </w:r>
     </w:p>
     <w:p>
@@ -1444,7 +1444,7 @@
         <w:t xml:space="preserve">Retrieved provenance: </w:t>
       </w:r>
       <w:r>
-        <w:t>[CORPUS: VCS_Bergama_Project-Description.norm, Project Crediting Period]; [CORPUS: VCS_Bergama_Project-Description.norm, Project Crediting Period]; [CORPUS: VCS_DRAFT_Yanjiang_Project-Description.norm, Project Crediting Period]; [CORPUS: VCS_DRAFT_Yanjiang_Project-Description.norm, Project Crediting Period]; [CORPUS: VCS_Guangzhou_Project-Description.norm, Project Crediting Period]</w:t>
+        <w:t>[CORPUS: VCS_Bergama_Project-Description.norm, Project Crediting Period]; [CORPUS: VCS_Bergama_Project-Description.norm, Project Crediting Period]; [CORPUS: VCS_Inegol_Project-Description.norm, Project Crediting Period]; [CORPUS: VCS_Inegol_Project-Description.norm, Project Crediting Period]; [CORPUS: VCS_Soc_Son_Project-Description.norm, Project Crediting Period]</w:t>
       </w:r>
     </w:p>
     <w:p>
@@ -1547,7 +1547,7 @@
         <w:t xml:space="preserve">Retrieved provenance: </w:t>
       </w:r>
       <w:r>
-        <w:t>[CORPUS: VCS_Bergama_Project-Description.norm, Project Scale and Estimated GHG Emission Reductions or Removals]; [CORPUS: VCS_Bergama_Project-Description.norm, Project Scale and Estimated GHG Emission Reductions or Removals]; [CORPUS: VCS_DRAFT_Yanjiang_Project-Description.norm, Project Scale and Estimated GHG Emission Reductions or Removals]; [CORPUS: VCS_DRAFT_Yanjiang_Project-Description.norm, Project Scale and Estimated GHG Emission Reductions or Removals]; [CORPUS: VCS_Guangzhou_Project-Description.norm, Project Scale and Estimated GHG Emission Reductions or Removals]</w:t>
+        <w:t>[CORPUS: VCS_Bergama_Project-Description.norm, Project Scale and Estimated GHG Emission Reductions or Removals]; [CORPUS: VCS_Bergama_Project-Description.norm, Project Scale and Estimated GHG Emission Reductions or Removals]; [CORPUS: VCS_Inegol_Project-Description.norm, Project Scale and Estimated GHG Emission Reductions or Removals]; [CORPUS: VCS_Inegol_Project-Description.norm, Project Scale and Estimated GHG Emission Reductions or Removals]; [CORPUS: VCS_Soc_Son_Project-Description.norm, Project Scale and Estimated GHG Emission Reductions or Removals]</w:t>
       </w:r>
     </w:p>
     <w:p>
@@ -1650,7 +1650,7 @@
         <w:t xml:space="preserve">Retrieved provenance: </w:t>
       </w:r>
       <w:r>
-        <w:t>[CORPUS: VCS_Bergama_Project-Description.norm, Description of the Project Activity]; [CORPUS: VCS_Bergama_Project-Description.norm, Description of the Project Activity]; [CORPUS: VCS_DRAFT_Yanjiang_Project-Description.norm, Description of the Project Activity]; [CORPUS: VCS_DRAFT_Yanjiang_Project-Description.norm, Description of the Project Activity]; [CORPUS: VCS_Guangzhou_Project-Description.norm, Description of the Project Activity]</w:t>
+        <w:t>[CORPUS: VCS_Bergama_Project-Description.norm, Description of the Project Activity]; [CORPUS: VCS_Bergama_Project-Description.norm, Description of the Project Activity]; [CORPUS: VCS_Inegol_Project-Description.norm, Description of the Project Activity]; [CORPUS: VCS_Inegol_Project-Description.norm, Description of the Project Activity]; [CORPUS: VCS_Soc_Son_Project-Description.norm, Description of the Project Activity]</w:t>
       </w:r>
     </w:p>
     <w:p>
@@ -1753,7 +1753,7 @@
         <w:t xml:space="preserve">Retrieved provenance: </w:t>
       </w:r>
       <w:r>
-        <w:t>[CORPUS: VCS_Bergama_Project-Description.norm, Project Location]; [CORPUS: VCS_Bergama_Project-Description.norm, Project Location]; [CORPUS: VCS_DRAFT_Yanjiang_Project-Description.norm, Project Location]; [CORPUS: VCS_DRAFT_Yanjiang_Project-Description.norm, Project Location]; [CORPUS: VCS_Guangzhou_Project-Description.norm, Project Location]</w:t>
+        <w:t>[CORPUS: VCS_Bergama_Project-Description.norm, Project Location]; [CORPUS: VCS_Bergama_Project-Description.norm, Project Location]; [CORPUS: VCS_Inegol_Project-Description.norm, Project Location]; [CORPUS: VCS_Inegol_Project-Description.norm, Project Location]; [CORPUS: VCS_Soc_Son_Project-Description.norm, Project Location]</w:t>
       </w:r>
     </w:p>
     <w:p>
@@ -1856,7 +1856,7 @@
         <w:t xml:space="preserve">Retrieved provenance: </w:t>
       </w:r>
       <w:r>
-        <w:t>[CORPUS: VCS_Bergama_Project-Description.norm, Conditions Prior to Project Initiation]; [CORPUS: VCS_Bergama_Project-Description.norm, Conditions Prior to Project Initiation]; [CORPUS: VCS_DRAFT_Yanjiang_Project-Description.norm, Conditions Prior to Project Initiation]; [CORPUS: VCS_DRAFT_Yanjiang_Project-Description.norm, Conditions Prior to Project Initiation]; [CORPUS: VCS_Guangzhou_Project-Description.norm, Conditions Prior to Project Initiation]</w:t>
+        <w:t>[CORPUS: VCS_Bergama_Project-Description.norm, Conditions Prior to Project Initiation]; [CORPUS: VCS_Bergama_Project-Description.norm, Conditions Prior to Project Initiation]; [CORPUS: VCS_Inegol_Project-Description.norm, Conditions Prior to Project Initiation]; [CORPUS: VCS_Inegol_Project-Description.norm, Conditions Prior to Project Initiation]; [CORPUS: VCS_Soc_Son_Project-Description.norm, Conditions Prior to Project Initiation]</w:t>
       </w:r>
     </w:p>
     <w:p>
@@ -1959,7 +1959,7 @@
         <w:t xml:space="preserve">Retrieved provenance: </w:t>
       </w:r>
       <w:r>
-        <w:t>[CORPUS: VCS_Bergama_Project-Description.norm, Compliance with Laws, Statutes and Other Regulatory Frameworks]; [CORPUS: VCS_Bergama_Project-Description.norm, Compliance with Laws, Statutes and Other Regulatory Frameworks]; [CORPUS: VCS_DRAFT_Yanjiang_Project-Description.norm, Compliance with Laws, Statutes and Other Regulatory Frameworks]; [CORPUS: VCS_DRAFT_Yanjiang_Project-Description.norm, Compliance with Laws, Statutes and Other Regulatory Frameworks]; [CORPUS: VCS_Guangzhou_Project-Description.norm, Compliance with Laws, Statutes and Other Regulatory Frameworks]</w:t>
+        <w:t>[CORPUS: VCS_Bergama_Project-Description.norm, Compliance with Laws, Statutes and Other Regulatory Frameworks]; [CORPUS: VCS_Bergama_Project-Description.norm, Compliance with Laws, Statutes and Other Regulatory Frameworks]; [CORPUS: VCS_Inegol_Project-Description.norm, Compliance with Laws, Statutes and Other Regulatory Frameworks]; [CORPUS: VCS_Inegol_Project-Description.norm, Compliance with Laws, Statutes and Other Regulatory Frameworks]; [CORPUS: VCS_Soc_Son_Project-Description.norm, Compliance with Laws, Statutes and Other Regulatory Frameworks]</w:t>
       </w:r>
     </w:p>
     <w:p>
@@ -2062,7 +2062,7 @@
         <w:t xml:space="preserve">Retrieved provenance: </w:t>
       </w:r>
       <w:r>
-        <w:t>[CORPUS: VCS_Bergama_Project-Description.norm, Participation under Other GHG Programs]; [CORPUS: VCS_Bergama_Project-Description.norm, Participation under Other GHG Programs]; [CORPUS: VCS_DRAFT_Yanjiang_Project-Description.norm, Participation under Other GHG Programs]; [CORPUS: VCS_DRAFT_Yanjiang_Project-Description.norm, Participation under Other GHG Programs]; [CORPUS: VCS_Guangzhou_Project-Description.norm, Participation under Other GHG Programs]</w:t>
+        <w:t>[CORPUS: VCS_Bergama_Project-Description.norm, Participation under Other GHG Programs]; [CORPUS: VCS_Bergama_Project-Description.norm, Participation under Other GHG Programs]; [CORPUS: VCS_Inegol_Project-Description.norm, Participation under Other GHG Programs]; [CORPUS: VCS_Inegol_Project-Description.norm, Participation under Other GHG Programs]; [CORPUS: VCS_Soc_Son_Project-Description.norm, Participation under Other GHG Programs]</w:t>
       </w:r>
     </w:p>
     <w:p>
@@ -2165,7 +2165,7 @@
         <w:t xml:space="preserve">Retrieved provenance: </w:t>
       </w:r>
       <w:r>
-        <w:t>[CORPUS: VCS_Bergama_Project-Description.norm, Other Forms of Credit]; [CORPUS: VCS_Bergama_Project-Description.norm, Other Forms of Credit]; [CORPUS: VCS_DRAFT_Yanjiang_Project-Description.norm, Other Forms of Credit]; [CORPUS: VCS_DRAFT_Yanjiang_Project-Description.norm, Other Forms of Credit]; [CORPUS: VCS_Guangzhou_Project-Description.norm, Other Forms of Credit]</w:t>
+        <w:t>[CORPUS: VCS_Bergama_Project-Description.norm, Other Forms of Credit]; [CORPUS: VCS_Bergama_Project-Description.norm, Other Forms of Credit]; [CORPUS: VCS_Inegol_Project-Description.norm, Other Forms of Credit]; [CORPUS: VCS_Inegol_Project-Description.norm, Other Forms of Credit]; [CORPUS: VCS_Soc_Son_Project-Description.norm, Other Forms of Credit]</w:t>
       </w:r>
     </w:p>
     <w:p>
@@ -2268,7 +2268,7 @@
         <w:t xml:space="preserve">Retrieved provenance: </w:t>
       </w:r>
       <w:r>
-        <w:t>[CORPUS: VCS_Bergama_Project-Description.norm, Sustainable Development Contributions]; [CORPUS: VCS_Bergama_Project-Description.norm, Sustainable Development Contributions]; [CORPUS: VCS_Bergama_Project-Description.norm, Sustainable Development Contributions]; [CORPUS: VCS_Bergama_Project-Description.norm, Sustainable Development Contributions]; [CORPUS: VCS_DRAFT_Yanjiang_Project-Description.norm, Sustainable Development Contributions]</w:t>
+        <w:t>[CORPUS: VCS_Bergama_Project-Description.norm, Sustainable Development Contributions]; [CORPUS: VCS_Bergama_Project-Description.norm, Sustainable Development Contributions]; [CORPUS: VCS_Bergama_Project-Description.norm, Sustainable Development Contributions]; [CORPUS: VCS_Bergama_Project-Description.norm, Sustainable Development Contributions]; [CORPUS: VCS_Inegol_Project-Description.norm, Sustainable Development Contributions]</w:t>
       </w:r>
     </w:p>
     <w:p>
@@ -2357,7 +2357,7 @@
         <w:t xml:space="preserve">Retrieved provenance: </w:t>
       </w:r>
       <w:r>
-        <w:t>[CORPUS: VCS_Bergama_Project-Description.norm, Additional Information Relevant to the Project]; [CORPUS: VCS_Bergama_Project-Description.norm, Additional Information Relevant to the Project]; [CORPUS: VCS_DRAFT_Yanjiang_Project-Description.norm, Additional Information Relevant to the Project]; [CORPUS: VCS_DRAFT_Yanjiang_Project-Description.norm, Additional Information Relevant to the Project]; [CORPUS: VCS_Guangzhou_Project-Description.norm, Additional Information Relevant to the Project]</w:t>
+        <w:t>[CORPUS: VCS_Bergama_Project-Description.norm, Additional Information Relevant to the Project]; [CORPUS: VCS_Bergama_Project-Description.norm, Additional Information Relevant to the Project]; [CORPUS: VCS_Inegol_Project-Description.norm, Additional Information Relevant to the Project]; [CORPUS: VCS_Inegol_Project-Description.norm, Additional Information Relevant to the Project]; [CORPUS: VCS_Soc_Son_Project-Description.norm, Additional Information Relevant to the Project]</w:t>
       </w:r>
     </w:p>
     <w:p>
@@ -2468,7 +2468,7 @@
         <w:t xml:space="preserve">Retrieved provenance: </w:t>
       </w:r>
       <w:r>
-        <w:t>[CORPUS: VCS_Bergama_Project-Description.norm, No Net Harm]; [CORPUS: VCS_Bergama_Project-Description.norm, No Net Harm]; [CORPUS: VCS_DRAFT_Yanjiang_Project-Description.norm, No Net Harm]; [CORPUS: VCS_DRAFT_Yanjiang_Project-Description.norm, No Net Harm]; [CORPUS: VCS_Guangzhou_Project-Description.norm, No Net Harm]</w:t>
+        <w:t>[CORPUS: VCS_Bergama_Project-Description.norm, No Net Harm]; [CORPUS: VCS_Bergama_Project-Description.norm, No Net Harm]; [CORPUS: VCS_Inegol_Project-Description.norm, No Net Harm]; [CORPUS: VCS_Inegol_Project-Description.norm, No Net Harm]; [CORPUS: VCS_Soc_Son_Project-Description.norm, No Net Harm]</w:t>
       </w:r>
     </w:p>
     <w:p>
@@ -2571,7 +2571,7 @@
         <w:t xml:space="preserve">Retrieved provenance: </w:t>
       </w:r>
       <w:r>
-        <w:t>[CORPUS: VCS_Bergama_Project-Description.norm, Local Stakeholder Consultation]; [CORPUS: VCS_Bergama_Project-Description.norm, Local Stakeholder Consultation]; [CORPUS: VCS_DRAFT_Yanjiang_Project-Description.norm, Local Stakeholder Consultation]; [CORPUS: VCS_DRAFT_Yanjiang_Project-Description.norm, Local Stakeholder Consultation]; [CORPUS: VCS_Guangzhou_Project-Description.norm, Local Stakeholder Consultation]</w:t>
+        <w:t>[CORPUS: VCS_Bergama_Project-Description.norm, Local Stakeholder Consultation]; [CORPUS: VCS_Bergama_Project-Description.norm, Local Stakeholder Consultation]; [CORPUS: VCS_Inegol_Project-Description.norm, Local Stakeholder Consultation]; [CORPUS: VCS_Inegol_Project-Description.norm, Local Stakeholder Consultation]; [CORPUS: VCS_Soc_Son_Project-Description.norm, Local Stakeholder Consultation]</w:t>
       </w:r>
     </w:p>
     <w:p>
@@ -2674,7 +2674,7 @@
         <w:t xml:space="preserve">Retrieved provenance: </w:t>
       </w:r>
       <w:r>
-        <w:t>[CORPUS: VCS_Bergama_Project-Description.norm, Environmental Impact]; [CORPUS: VCS_Bergama_Project-Description.norm, Environmental Impact]; [CORPUS: VCS_DRAFT_Yanjiang_Project-Description.norm, Environmental Impact]; [CORPUS: VCS_DRAFT_Yanjiang_Project-Description.norm, Environmental Impact]; [CORPUS: VCS_Guangzhou_Project-Description.norm, Environmental Impact]</w:t>
+        <w:t>[CORPUS: VCS_Bergama_Project-Description.norm, Environmental Impact]; [CORPUS: VCS_Bergama_Project-Description.norm, Environmental Impact]; [CORPUS: VCS_Inegol_Project-Description.norm, Environmental Impact]; [CORPUS: VCS_Inegol_Project-Description.norm, Environmental Impact]; [CORPUS: VCS_Inegol_Project-Description.norm, Environmental Impact]</w:t>
       </w:r>
     </w:p>
     <w:p>
@@ -2777,7 +2777,7 @@
         <w:t xml:space="preserve">Retrieved provenance: </w:t>
       </w:r>
       <w:r>
-        <w:t>[CORPUS: VCS_Bergama_Project-Description.norm, Public Comments]; [CORPUS: VCS_Bergama_Project-Description.norm, Public Comments]; [CORPUS: VCS_DRAFT_Yanjiang_Project-Description.norm, Public Comments]; [CORPUS: VCS_DRAFT_Yanjiang_Project-Description.norm, Public Comments]; [CORPUS: VCS_Guangzhou_Project-Description.norm, Public Comments]</w:t>
+        <w:t>[CORPUS: VCS_Bergama_Project-Description.norm, Public Comments]; [CORPUS: VCS_Bergama_Project-Description.norm, Public Comments]; [CORPUS: VCS_Inegol_Project-Description.norm, Public Comments]; [CORPUS: VCS_Inegol_Project-Description.norm, Public Comments]; [CORPUS: VCS_Soc_Son_Project-Description.norm, Public Comments]</w:t>
       </w:r>
     </w:p>
     <w:p>
@@ -2880,7 +2880,7 @@
         <w:t xml:space="preserve">Retrieved provenance: </w:t>
       </w:r>
       <w:r>
-        <w:t>[CORPUS: VCS_Bergama_Project-Description.norm, AFOLU-Specific Safeguards]; [CORPUS: VCS_DRAFT_Yanjiang_Project-Description.norm, AFOLU-Specific Safeguards]; [CORPUS: VCS_Guangzhou_Project-Description.norm, AFOLU-Specific Safeguards]; [CORPUS: VCS_Guanxi_Zhuang_Project_Description.norm, AFOLU-Specific Safeguards]; [CORPUS: VCS_Inegol_Project-Description.norm, AFOLU-Specific Safeguards]</w:t>
+        <w:t>[CORPUS: VCS_Bergama_Project-Description.norm, AFOLU-Specific Safeguards]; [CORPUS: VCS_Inegol_Project-Description.norm, AFOLU-Specific Safeguards]; [CORPUS: VCS_Soc_Son_Project-Description.norm, AFOLU-Specific Safeguards]</w:t>
       </w:r>
     </w:p>
     <w:p>
@@ -2991,7 +2991,7 @@
         <w:t xml:space="preserve">Retrieved provenance: </w:t>
       </w:r>
       <w:r>
-        <w:t>[CORPUS: VCS_Bergama_Project-Description.norm, Title and Reference of Methodology]; [CORPUS: VCS_Bergama_Project-Description.norm, Title and Reference of Methodology]; [CORPUS: VCS_DRAFT_Yanjiang_Project-Description.norm, Title and Reference of Methodology]; [CORPUS: VCS_DRAFT_Yanjiang_Project-Description.norm, Title and Reference of Methodology]; [CORPUS: VCS_Guangzhou_Project-Description.norm, Title and Reference of Methodology]</w:t>
+        <w:t>[CORPUS: VCS_Bergama_Project-Description.norm, Title and Reference of Methodology]; [CORPUS: VCS_Bergama_Project-Description.norm, Title and Reference of Methodology]; [CORPUS: VCS_Inegol_Project-Description.norm, Title and Reference of Methodology]; [CORPUS: VCS_Inegol_Project-Description.norm, Title and Reference of Methodology]; [CORPUS: VCS_Soc_Son_Project-Description.norm, Title and Reference of Methodology]</w:t>
       </w:r>
     </w:p>
     <w:p>
@@ -3094,7 +3094,7 @@
         <w:t xml:space="preserve">Retrieved provenance: </w:t>
       </w:r>
       <w:r>
-        <w:t>[CORPUS: VCS_Bergama_Project-Description.norm, Applicability of Methodology]; [CORPUS: VCS_Bergama_Project-Description.norm, Applicability of Methodology]; [CORPUS: VCS_DRAFT_Yanjiang_Project-Description.norm, Applicability of Methodology]; [CORPUS: VCS_DRAFT_Yanjiang_Project-Description.norm, Applicability of Methodology]; [CORPUS: VCS_Guangzhou_Project-Description.norm, Applicability of Methodology]</w:t>
+        <w:t>[CORPUS: VCS_Bergama_Project-Description.norm, Applicability of Methodology]; [CORPUS: VCS_Bergama_Project-Description.norm, Applicability of Methodology]; [CORPUS: VCS_Inegol_Project-Description.norm, Applicability of Methodology]; [CORPUS: VCS_Inegol_Project-Description.norm, Applicability of Methodology]; [CORPUS: VCS_Soc_Son_Project-Description.norm, Applicability of Methodology]</w:t>
       </w:r>
     </w:p>
     <w:p>
@@ -3197,7 +3197,7 @@
         <w:t xml:space="preserve">Retrieved provenance: </w:t>
       </w:r>
       <w:r>
-        <w:t>[CORPUS: VCS_Bergama_Project-Description.norm, Project Boundary]; [CORPUS: VCS_Bergama_Project-Description.norm, Project Boundary]; [CORPUS: VCS_DRAFT_Yanjiang_Project-Description.norm, Project Boundary]; [CORPUS: VCS_DRAFT_Yanjiang_Project-Description.norm, Project Boundary]; [CORPUS: VCS_Guangzhou_Project-Description.norm, Project Boundary]</w:t>
+        <w:t>[CORPUS: VCS_Bergama_Project-Description.norm, Project Boundary]; [CORPUS: VCS_Bergama_Project-Description.norm, Project Boundary]; [CORPUS: VCS_Inegol_Project-Description.norm, Project Boundary]; [CORPUS: VCS_Inegol_Project-Description.norm, Project Boundary]; [CORPUS: VCS_Soc_Son_Project-Description.norm, Project Boundary]</w:t>
       </w:r>
     </w:p>
     <w:p>
@@ -3300,7 +3300,7 @@
         <w:t xml:space="preserve">Retrieved provenance: </w:t>
       </w:r>
       <w:r>
-        <w:t>[CORPUS: VCS_Bergama_Project-Description.norm, Baseline Scenario]; [CORPUS: VCS_Bergama_Project-Description.norm, Baseline Scenario]; [CORPUS: VCS_DRAFT_Yanjiang_Project-Description.norm, Baseline Scenario]; [CORPUS: VCS_DRAFT_Yanjiang_Project-Description.norm, Baseline Scenario]; [CORPUS: VCS_Guangzhou_Project-Description.norm, Baseline Scenario]</w:t>
+        <w:t>[CORPUS: VCS_Bergama_Project-Description.norm, Baseline Scenario]; [CORPUS: VCS_Bergama_Project-Description.norm, Baseline Scenario]; [CORPUS: VCS_Inegol_Project-Description.norm, Baseline Scenario]; [CORPUS: VCS_Inegol_Project-Description.norm, Baseline Scenario]; [CORPUS: VCS_Soc_Son_Project-Description.norm, Baseline Scenario]</w:t>
       </w:r>
     </w:p>
     <w:p>
@@ -3403,7 +3403,7 @@
         <w:t xml:space="preserve">Retrieved provenance: </w:t>
       </w:r>
       <w:r>
-        <w:t>[CORPUS: VCS_Bergama_Project-Description.norm, Additionality]; [CORPUS: VCS_Bergama_Project-Description.norm, Additionality]; [CORPUS: VCS_DRAFT_Yanjiang_Project-Description.norm, Additionality]; [CORPUS: VCS_DRAFT_Yanjiang_Project-Description.norm, Additionality]; [CORPUS: VCS_Guangzhou_Project-Description.norm, Additionality]</w:t>
+        <w:t>[CORPUS: VCS_Bergama_Project-Description.norm, Additionality]; [CORPUS: VCS_Bergama_Project-Description.norm, Additionality]; [CORPUS: VCS_Inegol_Project-Description.norm, Additionality]; [CORPUS: VCS_Inegol_Project-Description.norm, Additionality]; [CORPUS: VCS_Soc_Son_Project-Description.norm, Additionality]</w:t>
       </w:r>
     </w:p>
     <w:p>
@@ -3506,7 +3506,7 @@
         <w:t xml:space="preserve">Retrieved provenance: </w:t>
       </w:r>
       <w:r>
-        <w:t>[CORPUS: VCS_Bergama_Project-Description.norm, Methodology Deviations]; [CORPUS: VCS_Bergama_Project-Description.norm, Methodology Deviations]; [CORPUS: VCS_Guangzhou_Project-Description.norm, Methodology Deviations]; [CORPUS: VCS_Guangzhou_Project-Description.norm, Methodology Deviations]; [CORPUS: VCS_Guanxi_Zhuang_Project_Description.norm, Methodology Deviations]</w:t>
+        <w:t>[CORPUS: VCS_Bergama_Project-Description.norm, Methodology Deviations]; [CORPUS: VCS_Bergama_Project-Description.norm, Methodology Deviations]; [CORPUS: VCS_Inegol_Project-Description.norm, Methodology Deviations]; [CORPUS: VCS_Inegol_Project-Description.norm, Methodology Deviations]; [CORPUS: VCS_Soc_Son_Project-Description.norm, Methodology Deviations]</w:t>
       </w:r>
     </w:p>
     <w:p>
@@ -3603,7 +3603,7 @@
         <w:t xml:space="preserve">Retrieved provenance: </w:t>
       </w:r>
       <w:r>
-        <w:t>[CORPUS: VCS_Bergama_Project-Description.norm, Baseline Emissions]; [CORPUS: VCS_Bergama_Project-Description.norm, Baseline Emissions]; [CORPUS: VCS_Bergama_Project-Description.norm, Baseline Emissions]; [CORPUS: VCS_Bergama_Project-Description.norm, Baseline Emissions]; [CORPUS: VCS_DRAFT_Yanjiang_Project-Description.norm, Baseline Emissions]</w:t>
+        <w:t>[CORPUS: VCS_Bergama_Project-Description.norm, Baseline Emissions]; [CORPUS: VCS_Bergama_Project-Description.norm, Baseline Emissions]; [CORPUS: VCS_Bergama_Project-Description.norm, Baseline Emissions]; [CORPUS: VCS_Bergama_Project-Description.norm, Baseline Emissions]; [CORPUS: VCS_Inegol_Project-Description.norm, Baseline Emissions]</w:t>
       </w:r>
     </w:p>
     <w:p>
@@ -3706,7 +3706,7 @@
         <w:t xml:space="preserve">Retrieved provenance: </w:t>
       </w:r>
       <w:r>
-        <w:t>[CORPUS: VCS_Bergama_Project-Description.norm, Project Emissions]; [CORPUS: VCS_Bergama_Project-Description.norm, Project Emissions]; [CORPUS: VCS_Bergama_Project-Description.norm, Project Emissions]; [CORPUS: VCS_Bergama_Project-Description.norm, Project Emissions]; [CORPUS: VCS_DRAFT_Yanjiang_Project-Description.norm, Project Emissions]</w:t>
+        <w:t>[CORPUS: VCS_Bergama_Project-Description.norm, Project Emissions]; [CORPUS: VCS_Bergama_Project-Description.norm, Project Emissions]; [CORPUS: VCS_Bergama_Project-Description.norm, Project Emissions]; [CORPUS: VCS_Bergama_Project-Description.norm, Project Emissions]; [CORPUS: VCS_Inegol_Project-Description.norm, Project Emissions]</w:t>
       </w:r>
     </w:p>
     <w:p>
@@ -3809,7 +3809,7 @@
         <w:t xml:space="preserve">Retrieved provenance: </w:t>
       </w:r>
       <w:r>
-        <w:t>[CORPUS: VCS_Bergama_Project-Description.norm, Leakage]; [CORPUS: VCS_Bergama_Project-Description.norm, Leakage]; [CORPUS: VCS_Bergama_Project-Description.norm, Leakage]; [CORPUS: VCS_Bergama_Project-Description.norm, Leakage]; [CORPUS: VCS_DRAFT_Yanjiang_Project-Description.norm, Leakage]</w:t>
+        <w:t>[CORPUS: VCS_Bergama_Project-Description.norm, Leakage]; [CORPUS: VCS_Bergama_Project-Description.norm, Leakage]; [CORPUS: VCS_Bergama_Project-Description.norm, Leakage]; [CORPUS: VCS_Bergama_Project-Description.norm, Leakage]; [CORPUS: VCS_Inegol_Project-Description.norm, Leakage]</w:t>
       </w:r>
     </w:p>
     <w:p>
@@ -3912,7 +3912,7 @@
         <w:t xml:space="preserve">Retrieved provenance: </w:t>
       </w:r>
       <w:r>
-        <w:t>[CORPUS: VCS_Bergama_Project-Description.norm, Net GHG Emission Reductions and Removals]; [CORPUS: VCS_Bergama_Project-Description.norm, Net GHG Emission Reductions and Removals]; [CORPUS: VCS_Bergama_Project-Description.norm, Net GHG Emission Reductions and Removals]; [CORPUS: VCS_Bergama_Project-Description.norm, Net GHG Emission Reductions and Removals]; [CORPUS: VCS_DRAFT_Yanjiang_Project-Description.norm, Net GHG Emission Reductions and Removals]</w:t>
+        <w:t>[CORPUS: VCS_Bergama_Project-Description.norm, Net GHG Emission Reductions and Removals]; [CORPUS: VCS_Bergama_Project-Description.norm, Net GHG Emission Reductions and Removals]; [CORPUS: VCS_Bergama_Project-Description.norm, Net GHG Emission Reductions and Removals]; [CORPUS: VCS_Bergama_Project-Description.norm, Net GHG Emission Reductions and Removals]; [CORPUS: VCS_Inegol_Project-Description.norm, Net GHG Emission Reductions and Removals]</w:t>
       </w:r>
     </w:p>
     <w:p>
@@ -4023,7 +4023,7 @@
         <w:t xml:space="preserve">Retrieved provenance: </w:t>
       </w:r>
       <w:r>
-        <w:t>[CORPUS: VCS_Bergama_Project-Description.norm, Data and Parameters Available at Validation]; [CORPUS: VCS_Bergama_Project-Description.norm, Data and Parameters Available at Validation]; [CORPUS: VCS_DRAFT_Yanjiang_Project-Description.norm, Data and Parameters Available at Validation]; [CORPUS: VCS_DRAFT_Yanjiang_Project-Description.norm, Data and Parameters Available at Validation]; [CORPUS: VCS_Guangzhou_Project-Description.norm, Data and Parameters Available at Validation]</w:t>
+        <w:t>[CORPUS: VCS_Bergama_Project-Description.norm, Data and Parameters Available at Validation]; [CORPUS: VCS_Bergama_Project-Description.norm, Data and Parameters Available at Validation]; [CORPUS: VCS_Inegol_Project-Description.norm, Data and Parameters Available at Validation]; [CORPUS: VCS_Inegol_Project-Description.norm, Data and Parameters Available at Validation]; [CORPUS: VCS_Soc_Son_Project-Description.norm, Data and Parameters Available at Validation]</w:t>
       </w:r>
     </w:p>
     <w:p>
@@ -4126,7 +4126,7 @@
         <w:t xml:space="preserve">Retrieved provenance: </w:t>
       </w:r>
       <w:r>
-        <w:t>[CORPUS: VCS_Bergama_Project-Description.norm, Data and Parameters Monitored]; [CORPUS: VCS_Bergama_Project-Description.norm, Data and Parameters Monitored]; [CORPUS: VCS_Bergama_Project-Description.norm, Data and Parameters Monitored]; [CORPUS: VCS_Bergama_Project-Description.norm, Data and Parameters Monitored]; [CORPUS: VCS_DRAFT_Yanjiang_Project-Description.norm, Data and Parameters Monitored]</w:t>
+        <w:t>[CORPUS: VCS_Bergama_Project-Description.norm, Data and Parameters Monitored]; [CORPUS: VCS_Bergama_Project-Description.norm, Data and Parameters Monitored]; [CORPUS: VCS_Bergama_Project-Description.norm, Data and Parameters Monitored]; [CORPUS: VCS_Bergama_Project-Description.norm, Data and Parameters Monitored]; [CORPUS: VCS_Inegol_Project-Description.norm, Data and Parameters Monitored]</w:t>
       </w:r>
     </w:p>
     <w:p>
@@ -4229,7 +4229,7 @@
         <w:t xml:space="preserve">Retrieved provenance: </w:t>
       </w:r>
       <w:r>
-        <w:t>[CORPUS: VCS_DRAFT_Yanjiang_Project-Description.norm, Monitoring Plan]; [CORPUS: VCS_Guangzhou_Project-Description.norm, Monitoring Plan]; [CORPUS: VCS_Guanxi_Zhuang_Project_Description.norm, Monitoring Plan]; [CORPUS: VCS_Inegol_Project-Description.norm, Monitoring Plan]; [CORPUS: VCS_Linfen_Project-Description.norm, Monitoring Plan]</w:t>
+        <w:t>[CORPUS: VCS_Inegol_Project-Description.norm, Monitoring Plan]; [CORPUS: VCS_Soc_Son_Project-Description.norm, Monitoring Plan]</w:t>
       </w:r>
     </w:p>
     <w:p>

</xml_diff>